<commit_message>
Documented my new Android application
</commit_message>
<xml_diff>
--- a/seminar/PicoBlaze.docx
+++ b/seminar/PicoBlaze.docx
@@ -23275,7 +23275,6 @@
       </w:pPr>
       <w:r>
         <w:rPr>
-          <w:rFonts w:ascii="Liberation Serif" w:hAnsi="Liberation Serif"/>
           <w:sz w:val="22"/>
           <w:szCs w:val="22"/>
           <w:lang w:val="en-US"/>
@@ -44817,6 +44816,35 @@
           <w:szCs w:val="22"/>
           <w:lang w:val="hr-HR"/>
         </w:rPr>
+        <w:t>Kasnije je u repozitorij dodana i datoteka nQueensPuzzle.asm koja predstavlja implementaciju tog istog algoritma u x86 assemblerskom jeziku kompatibilnim s FlatAssemblerom.</w:t>
+      </w:r>
+    </w:p>
+    <w:p>
+      <w:pPr>
+        <w:pStyle w:val="Normal"/>
+        <w:jc w:val="both"/>
+        <w:rPr>
+          <w:rFonts w:ascii="Times New Roman" w:hAnsi="Times New Roman"/>
+          <w:b w:val="false"/>
+          <w:bCs w:val="false"/>
+          <w:i w:val="false"/>
+          <w:iCs w:val="false"/>
+          <w:sz w:val="22"/>
+          <w:szCs w:val="22"/>
+          <w:lang w:val="hr-HR"/>
+        </w:rPr>
+      </w:pPr>
+      <w:r>
+        <w:rPr>
+          <w:rFonts w:ascii="Times New Roman" w:hAnsi="Times New Roman"/>
+          <w:b w:val="false"/>
+          <w:bCs w:val="false"/>
+          <w:i w:val="false"/>
+          <w:iCs w:val="false"/>
+          <w:sz w:val="22"/>
+          <w:szCs w:val="22"/>
+          <w:lang w:val="hr-HR"/>
+        </w:rPr>
         <w:t>U verziji v5.9.2 dodan je i primjer programa koji crta fraktal zvan Trokut Sierpinskog:</w:t>
       </w:r>
     </w:p>
@@ -47222,7 +47250,33 @@
           <w:szCs w:val="22"/>
           <w:lang w:val="hr-HR"/>
         </w:rPr>
-        <w:t xml:space="preserve">. Tako da sam pokušao napraviti native Android aplikaciju koja će omogućiti mobitelu da se pretvara da je PicoBlaze, dijelom i zato da se okušam kakav bih bio razvijatelj aplikacija za mobitele. Međutim, uz mnogo truda sve što sam uspio napraviti je da asembler pisan u JavaScriptu </w:t>
+        <w:t xml:space="preserve">. Tako da sam pokušao napraviti native Android aplikaciju koja će omogućiti mobitelu da se pretvara da je PicoBlaze, dijelom i zato da se okušam kakav bih bio razvijatelj aplikacija za mobitele. </w:t>
+      </w:r>
+      <w:r>
+        <w:rPr>
+          <w:rFonts w:ascii="Times New Roman" w:hAnsi="Times New Roman"/>
+          <w:b w:val="false"/>
+          <w:bCs w:val="false"/>
+          <w:i w:val="false"/>
+          <w:iCs w:val="false"/>
+          <w:sz w:val="22"/>
+          <w:szCs w:val="22"/>
+          <w:lang w:val="hr-HR"/>
+        </w:rPr>
+        <w:t>Prvo što sam</w:t>
+      </w:r>
+      <w:r>
+        <w:rPr>
+          <w:rFonts w:ascii="Times New Roman" w:hAnsi="Times New Roman"/>
+          <w:b w:val="false"/>
+          <w:bCs w:val="false"/>
+          <w:i w:val="false"/>
+          <w:iCs w:val="false"/>
+          <w:sz w:val="22"/>
+          <w:szCs w:val="22"/>
+          <w:lang w:val="hr-HR"/>
+        </w:rPr>
+        <w:t xml:space="preserve"> uz mnogo truda uspio napraviti je da asembler pisan u JavaScriptu </w:t>
       </w:r>
       <w:r>
         <w:rPr>
@@ -47417,7 +47471,7 @@
           <w:szCs w:val="22"/>
           <w:lang w:val="hr-HR"/>
         </w:rPr>
-        <w:t>pa sam odustao od te ideje</w:t>
+        <w:t>a onda sam na više godina odustao od te ideje</w:t>
       </w:r>
       <w:r>
         <w:rPr>
@@ -47443,7 +47497,494 @@
           <w:szCs w:val="22"/>
           <w:lang w:val="hr-HR"/>
         </w:rPr>
-        <w:t>Ako netko želi nastaviti taj moj rad, dostupan je na mom GitHub profilu</w:t>
+        <w:t xml:space="preserve">Kad se pojavila napredna umjetna inteligencija početkom 2026. godine, zadao sam GitHub Copilotu da prepiše moju datoteku </w:t>
+      </w:r>
+      <w:r>
+        <w:rPr>
+          <w:rFonts w:ascii="Courier New" w:hAnsi="Courier New"/>
+          <w:b w:val="false"/>
+          <w:bCs w:val="false"/>
+          <w:i w:val="false"/>
+          <w:iCs w:val="false"/>
+          <w:sz w:val="22"/>
+          <w:szCs w:val="22"/>
+          <w:lang w:val="hr-HR"/>
+        </w:rPr>
+        <w:t>simulator.js</w:t>
+      </w:r>
+      <w:r>
+        <w:rPr>
+          <w:rFonts w:ascii="Times New Roman" w:hAnsi="Times New Roman"/>
+          <w:b w:val="false"/>
+          <w:bCs w:val="false"/>
+          <w:i w:val="false"/>
+          <w:iCs w:val="false"/>
+          <w:sz w:val="22"/>
+          <w:szCs w:val="22"/>
+          <w:lang w:val="hr-HR"/>
+        </w:rPr>
+        <w:t xml:space="preserve"> iz JavaScripta u Javu. Rezultat je bio upotrebljiv, pa sam to upotrijebio da napravim assembler i emulator za PicoBlaze koji se može vrtjeti na Androidu.</w:t>
+      </w:r>
+    </w:p>
+    <w:p>
+      <w:pPr>
+        <w:pStyle w:val="Normal"/>
+        <w:jc w:val="both"/>
+        <w:rPr>
+          <w:rFonts w:ascii="Times New Roman" w:hAnsi="Times New Roman"/>
+          <w:b w:val="false"/>
+          <w:bCs w:val="false"/>
+          <w:i w:val="false"/>
+          <w:iCs w:val="false"/>
+          <w:sz w:val="22"/>
+          <w:szCs w:val="22"/>
+          <w:lang w:val="hr-HR"/>
+        </w:rPr>
+      </w:pPr>
+      <w:r>
+        <w:rPr>
+          <w:rFonts w:ascii="Times New Roman" w:hAnsi="Times New Roman"/>
+          <w:b w:val="false"/>
+          <w:bCs w:val="false"/>
+          <w:i w:val="false"/>
+          <w:iCs w:val="false"/>
+          <w:sz w:val="22"/>
+          <w:szCs w:val="22"/>
+          <w:lang w:val="hr-HR"/>
+        </w:rPr>
+        <w:drawing>
+          <wp:inline distT="0" distB="0" distL="0" distR="0">
+            <wp:extent cx="1802765" cy="3905885"/>
+            <wp:effectExtent l="0" t="0" r="0" b="0"/>
+            <wp:docPr id="45" name="Image26"/>
+            <wp:cNvGraphicFramePr>
+              <a:graphicFrameLocks xmlns:a="http://schemas.openxmlformats.org/drawingml/2006/main" noChangeAspect="1"/>
+            </wp:cNvGraphicFramePr>
+            <a:graphic xmlns:a="http://schemas.openxmlformats.org/drawingml/2006/main">
+              <a:graphicData uri="http://schemas.openxmlformats.org/drawingml/2006/picture">
+                <pic:pic xmlns:pic="http://schemas.openxmlformats.org/drawingml/2006/picture">
+                  <pic:nvPicPr>
+                    <pic:cNvPr id="45" name="Image26"/>
+                    <pic:cNvPicPr>
+                      <a:picLocks noChangeAspect="1" noChangeArrowheads="1"/>
+                    </pic:cNvPicPr>
+                  </pic:nvPicPr>
+                  <pic:blipFill>
+                    <a:blip r:embed="rId38"/>
+                    <a:stretch>
+                      <a:fillRect/>
+                    </a:stretch>
+                  </pic:blipFill>
+                  <pic:spPr bwMode="auto">
+                    <a:xfrm>
+                      <a:off x="0" y="0"/>
+                      <a:ext cx="1802765" cy="3905885"/>
+                    </a:xfrm>
+                    <a:prstGeom prst="rect">
+                      <a:avLst/>
+                    </a:prstGeom>
+                    <a:noFill/>
+                  </pic:spPr>
+                </pic:pic>
+              </a:graphicData>
+            </a:graphic>
+          </wp:inline>
+        </w:drawing>
+      </w:r>
+      <w:r>
+        <w:rPr>
+          <w:rFonts w:ascii="Times New Roman" w:hAnsi="Times New Roman"/>
+          <w:b w:val="false"/>
+          <w:bCs w:val="false"/>
+          <w:i w:val="false"/>
+          <w:iCs w:val="false"/>
+          <w:sz w:val="22"/>
+          <w:szCs w:val="22"/>
+          <w:lang w:val="hr-HR"/>
+        </w:rPr>
+        <w:t xml:space="preserve"> </w:t>
+      </w:r>
+      <w:r>
+        <w:rPr>
+          <w:rFonts w:ascii="Times New Roman" w:hAnsi="Times New Roman"/>
+          <w:b w:val="false"/>
+          <w:bCs w:val="false"/>
+          <w:i w:val="false"/>
+          <w:iCs w:val="false"/>
+          <w:sz w:val="22"/>
+          <w:szCs w:val="22"/>
+          <w:lang w:val="hr-HR"/>
+        </w:rPr>
+        <w:drawing>
+          <wp:inline distT="0" distB="0" distL="0" distR="0">
+            <wp:extent cx="1799590" cy="3898900"/>
+            <wp:effectExtent l="0" t="0" r="0" b="0"/>
+            <wp:docPr id="46" name="Image27"/>
+            <wp:cNvGraphicFramePr>
+              <a:graphicFrameLocks xmlns:a="http://schemas.openxmlformats.org/drawingml/2006/main" noChangeAspect="1"/>
+            </wp:cNvGraphicFramePr>
+            <a:graphic xmlns:a="http://schemas.openxmlformats.org/drawingml/2006/main">
+              <a:graphicData uri="http://schemas.openxmlformats.org/drawingml/2006/picture">
+                <pic:pic xmlns:pic="http://schemas.openxmlformats.org/drawingml/2006/picture">
+                  <pic:nvPicPr>
+                    <pic:cNvPr id="46" name="Image27"/>
+                    <pic:cNvPicPr>
+                      <a:picLocks noChangeAspect="1" noChangeArrowheads="1"/>
+                    </pic:cNvPicPr>
+                  </pic:nvPicPr>
+                  <pic:blipFill>
+                    <a:blip r:embed="rId39"/>
+                    <a:stretch>
+                      <a:fillRect/>
+                    </a:stretch>
+                  </pic:blipFill>
+                  <pic:spPr bwMode="auto">
+                    <a:xfrm>
+                      <a:off x="0" y="0"/>
+                      <a:ext cx="1799590" cy="3898900"/>
+                    </a:xfrm>
+                    <a:prstGeom prst="rect">
+                      <a:avLst/>
+                    </a:prstGeom>
+                    <a:noFill/>
+                  </pic:spPr>
+                </pic:pic>
+              </a:graphicData>
+            </a:graphic>
+          </wp:inline>
+        </w:drawing>
+      </w:r>
+      <w:r>
+        <w:rPr>
+          <w:rFonts w:ascii="Times New Roman" w:hAnsi="Times New Roman"/>
+          <w:b w:val="false"/>
+          <w:bCs w:val="false"/>
+          <w:i w:val="false"/>
+          <w:iCs w:val="false"/>
+          <w:sz w:val="22"/>
+          <w:szCs w:val="22"/>
+          <w:lang w:val="hr-HR"/>
+        </w:rPr>
+        <w:t xml:space="preserve"> </w:t>
+      </w:r>
+      <w:r>
+        <w:rPr>
+          <w:rFonts w:ascii="Times New Roman" w:hAnsi="Times New Roman"/>
+          <w:b w:val="false"/>
+          <w:bCs w:val="false"/>
+          <w:i w:val="false"/>
+          <w:iCs w:val="false"/>
+          <w:sz w:val="22"/>
+          <w:szCs w:val="22"/>
+          <w:lang w:val="hr-HR"/>
+        </w:rPr>
+        <w:drawing>
+          <wp:inline distT="0" distB="0" distL="0" distR="0">
+            <wp:extent cx="1799590" cy="3898265"/>
+            <wp:effectExtent l="0" t="0" r="0" b="0"/>
+            <wp:docPr id="47" name="Image28"/>
+            <wp:cNvGraphicFramePr>
+              <a:graphicFrameLocks xmlns:a="http://schemas.openxmlformats.org/drawingml/2006/main" noChangeAspect="1"/>
+            </wp:cNvGraphicFramePr>
+            <a:graphic xmlns:a="http://schemas.openxmlformats.org/drawingml/2006/main">
+              <a:graphicData uri="http://schemas.openxmlformats.org/drawingml/2006/picture">
+                <pic:pic xmlns:pic="http://schemas.openxmlformats.org/drawingml/2006/picture">
+                  <pic:nvPicPr>
+                    <pic:cNvPr id="47" name="Image28"/>
+                    <pic:cNvPicPr>
+                      <a:picLocks noChangeAspect="1" noChangeArrowheads="1"/>
+                    </pic:cNvPicPr>
+                  </pic:nvPicPr>
+                  <pic:blipFill>
+                    <a:blip r:embed="rId40"/>
+                    <a:stretch>
+                      <a:fillRect/>
+                    </a:stretch>
+                  </pic:blipFill>
+                  <pic:spPr bwMode="auto">
+                    <a:xfrm>
+                      <a:off x="0" y="0"/>
+                      <a:ext cx="1799590" cy="3898265"/>
+                    </a:xfrm>
+                    <a:prstGeom prst="rect">
+                      <a:avLst/>
+                    </a:prstGeom>
+                    <a:noFill/>
+                  </pic:spPr>
+                </pic:pic>
+              </a:graphicData>
+            </a:graphic>
+          </wp:inline>
+        </w:drawing>
+      </w:r>
+    </w:p>
+    <w:p>
+      <w:pPr>
+        <w:pStyle w:val="Normal"/>
+        <w:jc w:val="both"/>
+        <w:rPr>
+          <w:rFonts w:ascii="Times New Roman" w:hAnsi="Times New Roman"/>
+          <w:b w:val="false"/>
+          <w:bCs w:val="false"/>
+          <w:i w:val="false"/>
+          <w:iCs w:val="false"/>
+          <w:sz w:val="22"/>
+          <w:szCs w:val="22"/>
+          <w:lang w:val="hr-HR"/>
+        </w:rPr>
+      </w:pPr>
+      <w:r>
+        <w:rPr>
+          <w:rFonts w:ascii="Times New Roman" w:hAnsi="Times New Roman"/>
+          <w:b w:val="false"/>
+          <w:bCs w:val="false"/>
+          <w:i w:val="false"/>
+          <w:iCs w:val="false"/>
+          <w:sz w:val="22"/>
+          <w:szCs w:val="22"/>
+          <w:lang w:val="hr-HR"/>
+        </w:rPr>
+        <w:drawing>
+          <wp:inline distT="0" distB="0" distL="0" distR="0">
+            <wp:extent cx="1682115" cy="3644900"/>
+            <wp:effectExtent l="0" t="0" r="0" b="0"/>
+            <wp:docPr id="48" name="Image29"/>
+            <wp:cNvGraphicFramePr>
+              <a:graphicFrameLocks xmlns:a="http://schemas.openxmlformats.org/drawingml/2006/main" noChangeAspect="1"/>
+            </wp:cNvGraphicFramePr>
+            <a:graphic xmlns:a="http://schemas.openxmlformats.org/drawingml/2006/main">
+              <a:graphicData uri="http://schemas.openxmlformats.org/drawingml/2006/picture">
+                <pic:pic xmlns:pic="http://schemas.openxmlformats.org/drawingml/2006/picture">
+                  <pic:nvPicPr>
+                    <pic:cNvPr id="48" name="Image29"/>
+                    <pic:cNvPicPr>
+                      <a:picLocks noChangeAspect="1" noChangeArrowheads="1"/>
+                    </pic:cNvPicPr>
+                  </pic:nvPicPr>
+                  <pic:blipFill>
+                    <a:blip r:embed="rId41"/>
+                    <a:stretch>
+                      <a:fillRect/>
+                    </a:stretch>
+                  </pic:blipFill>
+                  <pic:spPr bwMode="auto">
+                    <a:xfrm>
+                      <a:off x="0" y="0"/>
+                      <a:ext cx="1682115" cy="3644900"/>
+                    </a:xfrm>
+                    <a:prstGeom prst="rect">
+                      <a:avLst/>
+                    </a:prstGeom>
+                    <a:noFill/>
+                  </pic:spPr>
+                </pic:pic>
+              </a:graphicData>
+            </a:graphic>
+          </wp:inline>
+        </w:drawing>
+      </w:r>
+      <w:r>
+        <w:rPr>
+          <w:rFonts w:ascii="Times New Roman" w:hAnsi="Times New Roman"/>
+          <w:b w:val="false"/>
+          <w:bCs w:val="false"/>
+          <w:i w:val="false"/>
+          <w:iCs w:val="false"/>
+          <w:sz w:val="22"/>
+          <w:szCs w:val="22"/>
+          <w:lang w:val="hr-HR"/>
+        </w:rPr>
+        <w:t xml:space="preserve"> </w:t>
+      </w:r>
+      <w:r>
+        <w:rPr>
+          <w:rFonts w:ascii="Times New Roman" w:hAnsi="Times New Roman"/>
+          <w:b w:val="false"/>
+          <w:bCs w:val="false"/>
+          <w:i w:val="false"/>
+          <w:iCs w:val="false"/>
+          <w:sz w:val="22"/>
+          <w:szCs w:val="22"/>
+          <w:lang w:val="hr-HR"/>
+        </w:rPr>
+        <w:drawing>
+          <wp:inline distT="0" distB="0" distL="0" distR="0">
+            <wp:extent cx="1694815" cy="3672205"/>
+            <wp:effectExtent l="0" t="0" r="0" b="0"/>
+            <wp:docPr id="49" name="Image30"/>
+            <wp:cNvGraphicFramePr>
+              <a:graphicFrameLocks xmlns:a="http://schemas.openxmlformats.org/drawingml/2006/main" noChangeAspect="1"/>
+            </wp:cNvGraphicFramePr>
+            <a:graphic xmlns:a="http://schemas.openxmlformats.org/drawingml/2006/main">
+              <a:graphicData uri="http://schemas.openxmlformats.org/drawingml/2006/picture">
+                <pic:pic xmlns:pic="http://schemas.openxmlformats.org/drawingml/2006/picture">
+                  <pic:nvPicPr>
+                    <pic:cNvPr id="49" name="Image30"/>
+                    <pic:cNvPicPr>
+                      <a:picLocks noChangeAspect="1" noChangeArrowheads="1"/>
+                    </pic:cNvPicPr>
+                  </pic:nvPicPr>
+                  <pic:blipFill>
+                    <a:blip r:embed="rId42"/>
+                    <a:stretch>
+                      <a:fillRect/>
+                    </a:stretch>
+                  </pic:blipFill>
+                  <pic:spPr bwMode="auto">
+                    <a:xfrm>
+                      <a:off x="0" y="0"/>
+                      <a:ext cx="1694815" cy="3672205"/>
+                    </a:xfrm>
+                    <a:prstGeom prst="rect">
+                      <a:avLst/>
+                    </a:prstGeom>
+                    <a:noFill/>
+                  </pic:spPr>
+                </pic:pic>
+              </a:graphicData>
+            </a:graphic>
+          </wp:inline>
+        </w:drawing>
+      </w:r>
+    </w:p>
+    <w:p>
+      <w:pPr>
+        <w:pStyle w:val="Normal"/>
+        <w:jc w:val="both"/>
+        <w:rPr/>
+      </w:pPr>
+      <w:r>
+        <w:rPr>
+          <w:rFonts w:ascii="Times New Roman" w:hAnsi="Times New Roman"/>
+          <w:b w:val="false"/>
+          <w:bCs w:val="false"/>
+          <w:i w:val="false"/>
+          <w:iCs w:val="false"/>
+          <w:sz w:val="22"/>
+          <w:szCs w:val="22"/>
+          <w:lang w:val="hr-HR"/>
+        </w:rPr>
+        <w:t xml:space="preserve">Mnogi na internetskim forumima kažu da, kad se s razvoja desktop ili mobilnih aplikacija prebaciš na razvoj web-aplikacija, kao da si se vratio dva desetljeća u prošlost. </w:t>
+      </w:r>
+      <w:r>
+        <w:rPr>
+          <w:rFonts w:ascii="Times New Roman" w:hAnsi="Times New Roman"/>
+          <w:b w:val="false"/>
+          <w:bCs w:val="false"/>
+          <w:i w:val="false"/>
+          <w:iCs w:val="false"/>
+          <w:sz w:val="22"/>
+          <w:szCs w:val="22"/>
+          <w:lang w:val="hr-HR"/>
+        </w:rPr>
+        <w:t xml:space="preserve">Meni se ne čini da je tako. </w:t>
+      </w:r>
+      <w:r>
+        <w:rPr>
+          <w:rFonts w:ascii="Times New Roman" w:hAnsi="Times New Roman"/>
+          <w:b w:val="false"/>
+          <w:bCs w:val="false"/>
+          <w:i w:val="false"/>
+          <w:iCs w:val="false"/>
+          <w:sz w:val="22"/>
+          <w:szCs w:val="22"/>
+          <w:lang w:val="hr-HR"/>
+        </w:rPr>
+        <w:t xml:space="preserve">Napraviti korisničko sučelje od gumbova i labela uistinu je lakše kad ciljaš mobitel nego kad ciljaš web: kad ciljaš mobitel, to možeš napraviti bez kodiranja. Popuniti tablicu podacima (kao što moj PicoBlaze Simulator puni tablicu podacima iz globalnog objekta </w:t>
+      </w:r>
+      <w:r>
+        <w:rPr>
+          <w:rFonts w:ascii="Courier New" w:hAnsi="Courier New"/>
+          <w:b w:val="false"/>
+          <w:bCs w:val="false"/>
+          <w:i w:val="false"/>
+          <w:iCs w:val="false"/>
+          <w:sz w:val="22"/>
+          <w:szCs w:val="22"/>
+          <w:lang w:val="hr-HR"/>
+        </w:rPr>
+        <w:t>machineCode</w:t>
+      </w:r>
+      <w:r>
+        <w:rPr>
+          <w:rFonts w:ascii="Times New Roman" w:hAnsi="Times New Roman"/>
+          <w:b w:val="false"/>
+          <w:bCs w:val="false"/>
+          <w:i w:val="false"/>
+          <w:iCs w:val="false"/>
+          <w:sz w:val="22"/>
+          <w:szCs w:val="22"/>
+          <w:lang w:val="hr-HR"/>
+        </w:rPr>
+        <w:t xml:space="preserve">, strojnim kodom u heksadekadskom obliku i linijama asemblerskog koda odakle dolaze naredbe) već </w:t>
+      </w:r>
+      <w:r>
+        <w:rPr>
+          <w:rFonts w:ascii="Times New Roman" w:hAnsi="Times New Roman"/>
+          <w:b w:val="false"/>
+          <w:bCs w:val="false"/>
+          <w:i w:val="false"/>
+          <w:iCs w:val="false"/>
+          <w:sz w:val="22"/>
+          <w:szCs w:val="22"/>
+          <w:lang w:val="hr-HR"/>
+        </w:rPr>
+        <w:t>je</w:t>
+      </w:r>
+      <w:r>
+        <w:rPr>
+          <w:rFonts w:ascii="Times New Roman" w:hAnsi="Times New Roman"/>
+          <w:b w:val="false"/>
+          <w:bCs w:val="false"/>
+          <w:i w:val="false"/>
+          <w:iCs w:val="false"/>
+          <w:sz w:val="22"/>
+          <w:szCs w:val="22"/>
+          <w:lang w:val="hr-HR"/>
+        </w:rPr>
+        <w:t xml:space="preserve"> podjednako teško na mobitelu i na webu. </w:t>
+      </w:r>
+      <w:r>
+        <w:rPr>
+          <w:rFonts w:ascii="Times New Roman" w:hAnsi="Times New Roman"/>
+          <w:b w:val="false"/>
+          <w:bCs w:val="false"/>
+          <w:i w:val="false"/>
+          <w:iCs w:val="false"/>
+          <w:sz w:val="22"/>
+          <w:szCs w:val="22"/>
+          <w:lang w:val="hr-HR"/>
+        </w:rPr>
+        <w:t>A dohvatiti nešto s interneta ili parsirati JSON daleko je lakše na webu nego na mobitelu.</w:t>
+      </w:r>
+    </w:p>
+    <w:p>
+      <w:pPr>
+        <w:pStyle w:val="Normal"/>
+        <w:jc w:val="both"/>
+        <w:rPr>
+          <w:rFonts w:ascii="Times New Roman" w:hAnsi="Times New Roman"/>
+          <w:b w:val="false"/>
+          <w:bCs w:val="false"/>
+          <w:i w:val="false"/>
+          <w:iCs w:val="false"/>
+          <w:sz w:val="22"/>
+          <w:szCs w:val="22"/>
+          <w:lang w:val="hr-HR"/>
+        </w:rPr>
+      </w:pPr>
+      <w:r>
+        <w:rPr>
+          <w:rFonts w:ascii="Times New Roman" w:hAnsi="Times New Roman"/>
+          <w:b w:val="false"/>
+          <w:bCs w:val="false"/>
+          <w:i w:val="false"/>
+          <w:iCs w:val="false"/>
+          <w:sz w:val="22"/>
+          <w:szCs w:val="22"/>
+          <w:lang w:val="hr-HR"/>
+        </w:rPr>
+        <w:t>Android aplikacija može se downloadati sa SourceForgea</w:t>
       </w:r>
       <w:r>
         <w:rPr>
@@ -47470,111 +48011,7 @@
           <w:szCs w:val="22"/>
           <w:lang w:val="hr-HR"/>
         </w:rPr>
-        <w:t xml:space="preserve">. </w:t>
-      </w:r>
-      <w:r>
-        <w:rPr>
-          <w:rFonts w:ascii="Times New Roman" w:hAnsi="Times New Roman"/>
-          <w:b w:val="false"/>
-          <w:bCs w:val="false"/>
-          <w:i w:val="false"/>
-          <w:iCs w:val="false"/>
-          <w:sz w:val="22"/>
-          <w:szCs w:val="22"/>
-          <w:lang w:val="hr-HR"/>
-        </w:rPr>
-        <w:t xml:space="preserve">Mnogi na internetskim forumima kažu da, kad se s razvoja desktop ili mobilnih aplikacija prebaciš na razvoj web-aplikacija, kao da si se vratio dva desetljeća u prošlost. </w:t>
-      </w:r>
-      <w:r>
-        <w:rPr>
-          <w:rFonts w:ascii="Times New Roman" w:hAnsi="Times New Roman"/>
-          <w:b w:val="false"/>
-          <w:bCs w:val="false"/>
-          <w:i w:val="false"/>
-          <w:iCs w:val="false"/>
-          <w:sz w:val="22"/>
-          <w:szCs w:val="22"/>
-          <w:lang w:val="hr-HR"/>
-        </w:rPr>
-        <w:t xml:space="preserve">Meni se ne čini da je tako. </w:t>
-      </w:r>
-      <w:r>
-        <w:rPr>
-          <w:rFonts w:ascii="Times New Roman" w:hAnsi="Times New Roman"/>
-          <w:b w:val="false"/>
-          <w:bCs w:val="false"/>
-          <w:i w:val="false"/>
-          <w:iCs w:val="false"/>
-          <w:sz w:val="22"/>
-          <w:szCs w:val="22"/>
-          <w:lang w:val="hr-HR"/>
-        </w:rPr>
-        <w:t xml:space="preserve">Napraviti korisničko sučelje od gumbova i labela uistinu je lakše kad ciljaš mobitel nego kad ciljaš web: kad ciljaš mobitel, to možeš napraviti bez kodiranja. Popuniti tablicu podacima (kao što moj PicoBlaze Simulator puni tablicu podacima iz globalnog objekta </w:t>
-      </w:r>
-      <w:r>
-        <w:rPr>
-          <w:rFonts w:ascii="Courier New" w:hAnsi="Courier New"/>
-          <w:b w:val="false"/>
-          <w:bCs w:val="false"/>
-          <w:i w:val="false"/>
-          <w:iCs w:val="false"/>
-          <w:sz w:val="22"/>
-          <w:szCs w:val="22"/>
-          <w:lang w:val="hr-HR"/>
-        </w:rPr>
-        <w:t>machineCode</w:t>
-      </w:r>
-      <w:r>
-        <w:rPr>
-          <w:rFonts w:ascii="Times New Roman" w:hAnsi="Times New Roman"/>
-          <w:b w:val="false"/>
-          <w:bCs w:val="false"/>
-          <w:i w:val="false"/>
-          <w:iCs w:val="false"/>
-          <w:sz w:val="22"/>
-          <w:szCs w:val="22"/>
-          <w:lang w:val="hr-HR"/>
-        </w:rPr>
-        <w:t xml:space="preserve">, strojnim kodom u heksadekadskom obliku i linijama asemblerskog koda odakle dolaze naredbe) već </w:t>
-      </w:r>
-      <w:r>
-        <w:rPr>
-          <w:rFonts w:ascii="Times New Roman" w:hAnsi="Times New Roman"/>
-          <w:b w:val="false"/>
-          <w:bCs w:val="false"/>
-          <w:i w:val="false"/>
-          <w:iCs w:val="false"/>
-          <w:sz w:val="22"/>
-          <w:szCs w:val="22"/>
-          <w:lang w:val="hr-HR"/>
-        </w:rPr>
-        <w:t>je</w:t>
-      </w:r>
-      <w:r>
-        <w:rPr>
-          <w:rFonts w:ascii="Times New Roman" w:hAnsi="Times New Roman"/>
-          <w:b w:val="false"/>
-          <w:bCs w:val="false"/>
-          <w:i w:val="false"/>
-          <w:iCs w:val="false"/>
-          <w:sz w:val="22"/>
-          <w:szCs w:val="22"/>
-          <w:lang w:val="hr-HR"/>
-        </w:rPr>
-        <w:t xml:space="preserve"> podjednako teško na mobitelu i na webu. </w:t>
-      </w:r>
-      <w:r>
-        <w:rPr>
-          <w:rFonts w:ascii="Times New Roman" w:hAnsi="Times New Roman"/>
-          <w:b w:val="false"/>
-          <w:bCs w:val="false"/>
-          <w:i w:val="false"/>
-          <w:iCs w:val="false"/>
-          <w:sz w:val="22"/>
-          <w:szCs w:val="22"/>
-          <w:lang w:val="hr-HR"/>
-        </w:rPr>
-        <w:t>A dohvatiti nešto s interneta ili parsirati JSON daleko je lakše na webu nego na mobitelu.</w:t>
+        <w:t>.</w:t>
       </w:r>
     </w:p>
     <w:p>
@@ -49342,7 +49779,7 @@
           <wp:inline distT="0" distB="0" distL="0" distR="0">
             <wp:extent cx="1698625" cy="437515"/>
             <wp:effectExtent l="0" t="0" r="0" b="0"/>
-            <wp:docPr id="45" name="Image4"/>
+            <wp:docPr id="50" name="Image4"/>
             <wp:cNvGraphicFramePr>
               <a:graphicFrameLocks xmlns:a="http://schemas.openxmlformats.org/drawingml/2006/main" noChangeAspect="1"/>
             </wp:cNvGraphicFramePr>
@@ -49350,13 +49787,13 @@
               <a:graphicData uri="http://schemas.openxmlformats.org/drawingml/2006/picture">
                 <pic:pic xmlns:pic="http://schemas.openxmlformats.org/drawingml/2006/picture">
                   <pic:nvPicPr>
-                    <pic:cNvPr id="45" name="Image4"/>
+                    <pic:cNvPr id="50" name="Image4"/>
                     <pic:cNvPicPr>
                       <a:picLocks noChangeAspect="1" noChangeArrowheads="1"/>
                     </pic:cNvPicPr>
                   </pic:nvPicPr>
                   <pic:blipFill>
-                    <a:blip r:embed="rId38"/>
+                    <a:blip r:embed="rId43"/>
                     <a:stretch>
                       <a:fillRect/>
                     </a:stretch>
@@ -51002,7 +51439,7 @@
           <w:rFonts w:ascii="Courier New" w:hAnsi="Courier New"/>
         </w:rPr>
         <w:tab/>
-        <w:t>https://github.com/FlatAssembler/PicoBlaze_Simulator_for_Android</w:t>
+        <w:t>https://sourceforge.net/projects/picoblaze-android/files/latest/download</w:t>
       </w:r>
     </w:p>
   </w:footnote>

</xml_diff>

<commit_message>
Documented what's new in the new version of PicoBlaze simulator for Android
</commit_message>
<xml_diff>
--- a/seminar/PicoBlaze.docx
+++ b/seminar/PicoBlaze.docx
@@ -32813,7 +32813,33 @@
           <w:szCs w:val="22"/>
           <w:lang w:val="hr-HR"/>
         </w:rPr>
-        <w:t xml:space="preserve"> – login forma u PHP-u, bez JavaScripta. Koristi veoma moderan CSS kombinirajući flexbox i grid. Ne prikazuje se posve ispravno u Firefoxu 52 (posljednjoj verziji Firefoxa koja se vrti na Windows XP-u) jer Firefox 52 ignorira naredbu gap na CSS gridu. Ovako izgleda u modernim internetskim preglednicima:</w:t>
+        <w:t xml:space="preserve"> – login forma u PHP-u, bez JavaScripta. Koristi veoma moderan CSS kombinirajući flexbox i grid. Ne prikazuje se posve ispravno u Firefoxu 52 (posljednjoj verziji Firefoxa koja se vrti na Windows XP-u) jer Firefox 52 ignorira naredbu </w:t>
+      </w:r>
+      <w:r>
+        <w:rPr>
+          <w:rFonts w:ascii="Courier New" w:hAnsi="Courier New"/>
+          <w:b w:val="false"/>
+          <w:bCs w:val="false"/>
+          <w:i w:val="false"/>
+          <w:iCs w:val="false"/>
+          <w:sz w:val="22"/>
+          <w:szCs w:val="22"/>
+          <w:lang w:val="hr-HR"/>
+        </w:rPr>
+        <w:t>gap</w:t>
+      </w:r>
+      <w:r>
+        <w:rPr>
+          <w:rFonts w:ascii="Times New Roman" w:hAnsi="Times New Roman"/>
+          <w:b w:val="false"/>
+          <w:bCs w:val="false"/>
+          <w:i w:val="false"/>
+          <w:iCs w:val="false"/>
+          <w:sz w:val="22"/>
+          <w:szCs w:val="22"/>
+          <w:lang w:val="hr-HR"/>
+        </w:rPr>
+        <w:t xml:space="preserve"> na CSS gridu. Ovako izgleda u modernim internetskim preglednicima:</w:t>
       </w:r>
     </w:p>
     <w:p>
@@ -47984,6 +48010,901 @@
           <w:szCs w:val="22"/>
           <w:lang w:val="hr-HR"/>
         </w:rPr>
+        <w:t>Najveći problem na koji sam naletio pri pravljenju Android aplikacije bilo je da se u Register Dump activityju pokazuje PC registar, koji je isti za oba regbanka, pa bi za njega imalo smisla napraviti da mu, u rječniku HTML-a, colspan bude jednak dvojci. Ovako:</w:t>
+      </w:r>
+    </w:p>
+    <w:p>
+      <w:pPr>
+        <w:pStyle w:val="Normal"/>
+        <w:jc w:val="both"/>
+        <w:rPr>
+          <w:rFonts w:ascii="Times New Roman" w:hAnsi="Times New Roman"/>
+          <w:b w:val="false"/>
+          <w:bCs w:val="false"/>
+          <w:i w:val="false"/>
+          <w:iCs w:val="false"/>
+          <w:sz w:val="22"/>
+          <w:szCs w:val="22"/>
+          <w:lang w:val="hr-HR"/>
+        </w:rPr>
+      </w:pPr>
+      <w:r>
+        <w:rPr>
+          <w:rFonts w:ascii="Times New Roman" w:hAnsi="Times New Roman"/>
+          <w:b w:val="false"/>
+          <w:bCs w:val="false"/>
+          <w:i w:val="false"/>
+          <w:iCs w:val="false"/>
+          <w:sz w:val="22"/>
+          <w:szCs w:val="22"/>
+          <w:lang w:val="hr-HR"/>
+        </w:rPr>
+        <w:drawing>
+          <wp:inline distT="0" distB="0" distL="0" distR="0">
+            <wp:extent cx="2131695" cy="4618355"/>
+            <wp:effectExtent l="0" t="0" r="0" b="0"/>
+            <wp:docPr id="50" name="Image31"/>
+            <wp:cNvGraphicFramePr>
+              <a:graphicFrameLocks xmlns:a="http://schemas.openxmlformats.org/drawingml/2006/main" noChangeAspect="1"/>
+            </wp:cNvGraphicFramePr>
+            <a:graphic xmlns:a="http://schemas.openxmlformats.org/drawingml/2006/main">
+              <a:graphicData uri="http://schemas.openxmlformats.org/drawingml/2006/picture">
+                <pic:pic xmlns:pic="http://schemas.openxmlformats.org/drawingml/2006/picture">
+                  <pic:nvPicPr>
+                    <pic:cNvPr id="50" name="Image31"/>
+                    <pic:cNvPicPr>
+                      <a:picLocks noChangeAspect="1" noChangeArrowheads="1"/>
+                    </pic:cNvPicPr>
+                  </pic:nvPicPr>
+                  <pic:blipFill>
+                    <a:blip r:embed="rId43"/>
+                    <a:stretch>
+                      <a:fillRect/>
+                    </a:stretch>
+                  </pic:blipFill>
+                  <pic:spPr bwMode="auto">
+                    <a:xfrm>
+                      <a:off x="0" y="0"/>
+                      <a:ext cx="2131695" cy="4618355"/>
+                    </a:xfrm>
+                    <a:prstGeom prst="rect">
+                      <a:avLst/>
+                    </a:prstGeom>
+                    <a:noFill/>
+                  </pic:spPr>
+                </pic:pic>
+              </a:graphicData>
+            </a:graphic>
+          </wp:inline>
+        </w:drawing>
+      </w:r>
+    </w:p>
+    <w:p>
+      <w:pPr>
+        <w:pStyle w:val="Normal"/>
+        <w:jc w:val="both"/>
+        <w:rPr>
+          <w:rFonts w:ascii="Times New Roman" w:hAnsi="Times New Roman"/>
+          <w:b w:val="false"/>
+          <w:bCs w:val="false"/>
+          <w:i w:val="false"/>
+          <w:iCs w:val="false"/>
+          <w:sz w:val="22"/>
+          <w:szCs w:val="22"/>
+          <w:lang w:val="hr-HR"/>
+        </w:rPr>
+      </w:pPr>
+      <w:r>
+        <w:rPr>
+          <w:rFonts w:ascii="Times New Roman" w:hAnsi="Times New Roman"/>
+          <w:b w:val="false"/>
+          <w:bCs w:val="false"/>
+          <w:i w:val="false"/>
+          <w:iCs w:val="false"/>
+          <w:sz w:val="22"/>
+          <w:szCs w:val="22"/>
+          <w:lang w:val="hr-HR"/>
+        </w:rPr>
+        <w:t>To sam, na prijedlog GitHub Copilota, riješio tako da postavim WeightSum od LinearLayouta na tri u XML-u, i zatim za svaki table cell s nazivom Regbank A i Regbank B dohvaća LayoutConstraints, i ako je to Regbank A u PC-u, postavlja mu Weight na 2 i vraća ga sa setLayoutConstraints, i zatim Regbank B postavi visibility na GONE, a inače weight postavlja na jedinicu, a visibility od Regbank B na VISIBLE. Ovako:</w:t>
+      </w:r>
+    </w:p>
+    <w:p>
+      <w:pPr>
+        <w:pStyle w:val="Normal"/>
+        <w:jc w:val="both"/>
+        <w:rPr>
+          <w:rFonts w:ascii="Courier New" w:hAnsi="Courier New"/>
+          <w:b w:val="false"/>
+          <w:bCs w:val="false"/>
+          <w:i w:val="false"/>
+          <w:iCs w:val="false"/>
+          <w:sz w:val="22"/>
+          <w:szCs w:val="22"/>
+          <w:lang w:val="hr-HR"/>
+        </w:rPr>
+      </w:pPr>
+      <w:r>
+        <w:rPr>
+          <w:rFonts w:ascii="Courier New" w:hAnsi="Courier New"/>
+          <w:b w:val="false"/>
+          <w:bCs w:val="false"/>
+          <w:i w:val="false"/>
+          <w:iCs w:val="false"/>
+          <w:sz w:val="22"/>
+          <w:szCs w:val="22"/>
+          <w:lang w:val="hr-HR"/>
+        </w:rPr>
+        <w:t>if (position == 17) {</w:t>
+      </w:r>
+    </w:p>
+    <w:p>
+      <w:pPr>
+        <w:pStyle w:val="Normal"/>
+        <w:jc w:val="both"/>
+        <w:rPr>
+          <w:rFonts w:ascii="Courier New" w:hAnsi="Courier New"/>
+          <w:b w:val="false"/>
+          <w:bCs w:val="false"/>
+          <w:i w:val="false"/>
+          <w:iCs w:val="false"/>
+          <w:sz w:val="22"/>
+          <w:szCs w:val="22"/>
+          <w:lang w:val="hr-HR"/>
+        </w:rPr>
+      </w:pPr>
+      <w:r>
+        <w:rPr>
+          <w:rFonts w:ascii="Courier New" w:hAnsi="Courier New"/>
+          <w:b w:val="false"/>
+          <w:bCs w:val="false"/>
+          <w:i w:val="false"/>
+          <w:iCs w:val="false"/>
+          <w:sz w:val="22"/>
+          <w:szCs w:val="22"/>
+          <w:lang w:val="hr-HR"/>
+        </w:rPr>
+      </w:r>
+    </w:p>
+    <w:p>
+      <w:pPr>
+        <w:pStyle w:val="Normal"/>
+        <w:jc w:val="both"/>
+        <w:rPr>
+          <w:rFonts w:ascii="Courier New" w:hAnsi="Courier New"/>
+          <w:b w:val="false"/>
+          <w:bCs w:val="false"/>
+          <w:i w:val="false"/>
+          <w:iCs w:val="false"/>
+          <w:sz w:val="22"/>
+          <w:szCs w:val="22"/>
+          <w:lang w:val="hr-HR"/>
+        </w:rPr>
+      </w:pPr>
+      <w:r>
+        <w:rPr>
+          <w:rFonts w:ascii="Courier New" w:hAnsi="Courier New"/>
+          <w:b w:val="false"/>
+          <w:bCs w:val="false"/>
+          <w:i w:val="false"/>
+          <w:iCs w:val="false"/>
+          <w:sz w:val="22"/>
+          <w:szCs w:val="22"/>
+          <w:lang w:val="hr-HR"/>
+        </w:rPr>
+        <w:t xml:space="preserve">        </w:t>
+      </w:r>
+      <w:r>
+        <w:rPr>
+          <w:rFonts w:ascii="Courier New" w:hAnsi="Courier New"/>
+          <w:b w:val="false"/>
+          <w:bCs w:val="false"/>
+          <w:i w:val="false"/>
+          <w:iCs w:val="false"/>
+          <w:sz w:val="22"/>
+          <w:szCs w:val="22"/>
+          <w:lang w:val="hr-HR"/>
+        </w:rPr>
+        <w:t>holder.getRegisterNameView().setText("PC");</w:t>
+      </w:r>
+    </w:p>
+    <w:p>
+      <w:pPr>
+        <w:pStyle w:val="Normal"/>
+        <w:jc w:val="both"/>
+        <w:rPr>
+          <w:rFonts w:ascii="Courier New" w:hAnsi="Courier New"/>
+          <w:b w:val="false"/>
+          <w:bCs w:val="false"/>
+          <w:i w:val="false"/>
+          <w:iCs w:val="false"/>
+          <w:sz w:val="22"/>
+          <w:szCs w:val="22"/>
+          <w:lang w:val="hr-HR"/>
+        </w:rPr>
+      </w:pPr>
+      <w:r>
+        <w:rPr>
+          <w:rFonts w:ascii="Courier New" w:hAnsi="Courier New"/>
+          <w:b w:val="false"/>
+          <w:bCs w:val="false"/>
+          <w:i w:val="false"/>
+          <w:iCs w:val="false"/>
+          <w:sz w:val="22"/>
+          <w:szCs w:val="22"/>
+          <w:lang w:val="hr-HR"/>
+        </w:rPr>
+        <w:t xml:space="preserve">        </w:t>
+      </w:r>
+      <w:r>
+        <w:rPr>
+          <w:rFonts w:ascii="Courier New" w:hAnsi="Courier New"/>
+          <w:b w:val="false"/>
+          <w:bCs w:val="false"/>
+          <w:i w:val="false"/>
+          <w:iCs w:val="false"/>
+          <w:sz w:val="22"/>
+          <w:szCs w:val="22"/>
+          <w:lang w:val="hr-HR"/>
+        </w:rPr>
+        <w:t>holder.getRegbankAView().setText(String.format("%03x", simulator.PC));</w:t>
+      </w:r>
+    </w:p>
+    <w:p>
+      <w:pPr>
+        <w:pStyle w:val="Normal"/>
+        <w:jc w:val="both"/>
+        <w:rPr>
+          <w:rFonts w:ascii="Courier New" w:hAnsi="Courier New"/>
+          <w:b w:val="false"/>
+          <w:bCs w:val="false"/>
+          <w:i w:val="false"/>
+          <w:iCs w:val="false"/>
+          <w:sz w:val="22"/>
+          <w:szCs w:val="22"/>
+          <w:lang w:val="hr-HR"/>
+        </w:rPr>
+      </w:pPr>
+      <w:r>
+        <w:rPr>
+          <w:rFonts w:ascii="Courier New" w:hAnsi="Courier New"/>
+          <w:b w:val="false"/>
+          <w:bCs w:val="false"/>
+          <w:i w:val="false"/>
+          <w:iCs w:val="false"/>
+          <w:sz w:val="22"/>
+          <w:szCs w:val="22"/>
+          <w:lang w:val="hr-HR"/>
+        </w:rPr>
+        <w:t xml:space="preserve">        </w:t>
+      </w:r>
+      <w:r>
+        <w:rPr>
+          <w:rFonts w:ascii="Courier New" w:hAnsi="Courier New"/>
+          <w:b w:val="false"/>
+          <w:bCs w:val="false"/>
+          <w:i w:val="false"/>
+          <w:iCs w:val="false"/>
+          <w:sz w:val="22"/>
+          <w:szCs w:val="22"/>
+          <w:lang w:val="hr-HR"/>
+        </w:rPr>
+        <w:t>LinearLayout.LayoutParams params = (LinearLayout.LayoutParams) holder.getRegbankAView().getLayoutParams();</w:t>
+      </w:r>
+    </w:p>
+    <w:p>
+      <w:pPr>
+        <w:pStyle w:val="Normal"/>
+        <w:jc w:val="both"/>
+        <w:rPr>
+          <w:rFonts w:ascii="Courier New" w:hAnsi="Courier New"/>
+          <w:b w:val="false"/>
+          <w:bCs w:val="false"/>
+          <w:i w:val="false"/>
+          <w:iCs w:val="false"/>
+          <w:sz w:val="22"/>
+          <w:szCs w:val="22"/>
+          <w:lang w:val="hr-HR"/>
+        </w:rPr>
+      </w:pPr>
+      <w:r>
+        <w:rPr>
+          <w:rFonts w:ascii="Courier New" w:hAnsi="Courier New"/>
+          <w:b w:val="false"/>
+          <w:bCs w:val="false"/>
+          <w:i w:val="false"/>
+          <w:iCs w:val="false"/>
+          <w:sz w:val="22"/>
+          <w:szCs w:val="22"/>
+          <w:lang w:val="hr-HR"/>
+        </w:rPr>
+        <w:t xml:space="preserve">        </w:t>
+      </w:r>
+      <w:r>
+        <w:rPr>
+          <w:rFonts w:ascii="Courier New" w:hAnsi="Courier New"/>
+          <w:b w:val="false"/>
+          <w:bCs w:val="false"/>
+          <w:i w:val="false"/>
+          <w:iCs w:val="false"/>
+          <w:sz w:val="22"/>
+          <w:szCs w:val="22"/>
+          <w:lang w:val="hr-HR"/>
+        </w:rPr>
+        <w:t>params.weight = 2;</w:t>
+      </w:r>
+    </w:p>
+    <w:p>
+      <w:pPr>
+        <w:pStyle w:val="Normal"/>
+        <w:jc w:val="both"/>
+        <w:rPr>
+          <w:rFonts w:ascii="Courier New" w:hAnsi="Courier New"/>
+          <w:b w:val="false"/>
+          <w:bCs w:val="false"/>
+          <w:i w:val="false"/>
+          <w:iCs w:val="false"/>
+          <w:sz w:val="22"/>
+          <w:szCs w:val="22"/>
+          <w:lang w:val="hr-HR"/>
+        </w:rPr>
+      </w:pPr>
+      <w:r>
+        <w:rPr>
+          <w:rFonts w:ascii="Courier New" w:hAnsi="Courier New"/>
+          <w:b w:val="false"/>
+          <w:bCs w:val="false"/>
+          <w:i w:val="false"/>
+          <w:iCs w:val="false"/>
+          <w:sz w:val="22"/>
+          <w:szCs w:val="22"/>
+          <w:lang w:val="hr-HR"/>
+        </w:rPr>
+        <w:t xml:space="preserve">        </w:t>
+      </w:r>
+      <w:r>
+        <w:rPr>
+          <w:rFonts w:ascii="Courier New" w:hAnsi="Courier New"/>
+          <w:b w:val="false"/>
+          <w:bCs w:val="false"/>
+          <w:i w:val="false"/>
+          <w:iCs w:val="false"/>
+          <w:sz w:val="22"/>
+          <w:szCs w:val="22"/>
+          <w:lang w:val="hr-HR"/>
+        </w:rPr>
+        <w:t>holder.getRegbankAView().setLayoutParams(params);</w:t>
+      </w:r>
+    </w:p>
+    <w:p>
+      <w:pPr>
+        <w:pStyle w:val="Normal"/>
+        <w:jc w:val="both"/>
+        <w:rPr>
+          <w:rFonts w:ascii="Courier New" w:hAnsi="Courier New"/>
+          <w:b w:val="false"/>
+          <w:bCs w:val="false"/>
+          <w:i w:val="false"/>
+          <w:iCs w:val="false"/>
+          <w:sz w:val="22"/>
+          <w:szCs w:val="22"/>
+          <w:lang w:val="hr-HR"/>
+        </w:rPr>
+      </w:pPr>
+      <w:r>
+        <w:rPr>
+          <w:rFonts w:ascii="Courier New" w:hAnsi="Courier New"/>
+          <w:b w:val="false"/>
+          <w:bCs w:val="false"/>
+          <w:i w:val="false"/>
+          <w:iCs w:val="false"/>
+          <w:sz w:val="22"/>
+          <w:szCs w:val="22"/>
+          <w:lang w:val="hr-HR"/>
+        </w:rPr>
+        <w:t xml:space="preserve">        </w:t>
+      </w:r>
+      <w:r>
+        <w:rPr>
+          <w:rFonts w:ascii="Courier New" w:hAnsi="Courier New"/>
+          <w:b w:val="false"/>
+          <w:bCs w:val="false"/>
+          <w:i w:val="false"/>
+          <w:iCs w:val="false"/>
+          <w:sz w:val="22"/>
+          <w:szCs w:val="22"/>
+          <w:lang w:val="hr-HR"/>
+        </w:rPr>
+        <w:t>holder.getRegbankBView().setVisibility(View.GONE);</w:t>
+      </w:r>
+    </w:p>
+    <w:p>
+      <w:pPr>
+        <w:pStyle w:val="Normal"/>
+        <w:jc w:val="both"/>
+        <w:rPr>
+          <w:rFonts w:ascii="Courier New" w:hAnsi="Courier New"/>
+          <w:b w:val="false"/>
+          <w:bCs w:val="false"/>
+          <w:i w:val="false"/>
+          <w:iCs w:val="false"/>
+          <w:sz w:val="22"/>
+          <w:szCs w:val="22"/>
+          <w:lang w:val="hr-HR"/>
+        </w:rPr>
+      </w:pPr>
+      <w:r>
+        <w:rPr>
+          <w:rFonts w:ascii="Courier New" w:hAnsi="Courier New"/>
+          <w:b w:val="false"/>
+          <w:bCs w:val="false"/>
+          <w:i w:val="false"/>
+          <w:iCs w:val="false"/>
+          <w:sz w:val="22"/>
+          <w:szCs w:val="22"/>
+          <w:lang w:val="hr-HR"/>
+        </w:rPr>
+        <w:t xml:space="preserve">            </w:t>
+      </w:r>
+      <w:r>
+        <w:rPr>
+          <w:rFonts w:ascii="Courier New" w:hAnsi="Courier New"/>
+          <w:b w:val="false"/>
+          <w:bCs w:val="false"/>
+          <w:i w:val="false"/>
+          <w:iCs w:val="false"/>
+          <w:sz w:val="22"/>
+          <w:szCs w:val="22"/>
+          <w:lang w:val="hr-HR"/>
+        </w:rPr>
+        <w:t>holder.getRegisterNameView().setTypeface(null, NORMAL);</w:t>
+      </w:r>
+    </w:p>
+    <w:p>
+      <w:pPr>
+        <w:pStyle w:val="Normal"/>
+        <w:jc w:val="both"/>
+        <w:rPr>
+          <w:rFonts w:ascii="Courier New" w:hAnsi="Courier New"/>
+          <w:b w:val="false"/>
+          <w:bCs w:val="false"/>
+          <w:i w:val="false"/>
+          <w:iCs w:val="false"/>
+          <w:sz w:val="22"/>
+          <w:szCs w:val="22"/>
+          <w:lang w:val="hr-HR"/>
+        </w:rPr>
+      </w:pPr>
+      <w:r>
+        <w:rPr>
+          <w:rFonts w:ascii="Courier New" w:hAnsi="Courier New"/>
+          <w:b w:val="false"/>
+          <w:bCs w:val="false"/>
+          <w:i w:val="false"/>
+          <w:iCs w:val="false"/>
+          <w:sz w:val="22"/>
+          <w:szCs w:val="22"/>
+          <w:lang w:val="hr-HR"/>
+        </w:rPr>
+        <w:t xml:space="preserve">            </w:t>
+      </w:r>
+      <w:r>
+        <w:rPr>
+          <w:rFonts w:ascii="Courier New" w:hAnsi="Courier New"/>
+          <w:b w:val="false"/>
+          <w:bCs w:val="false"/>
+          <w:i w:val="false"/>
+          <w:iCs w:val="false"/>
+          <w:sz w:val="22"/>
+          <w:szCs w:val="22"/>
+          <w:lang w:val="hr-HR"/>
+        </w:rPr>
+        <w:t>holder.getRegbankAView().setTypeface(null, NORMAL);</w:t>
+      </w:r>
+    </w:p>
+    <w:p>
+      <w:pPr>
+        <w:pStyle w:val="Normal"/>
+        <w:jc w:val="both"/>
+        <w:rPr>
+          <w:rFonts w:ascii="Courier New" w:hAnsi="Courier New"/>
+          <w:b w:val="false"/>
+          <w:bCs w:val="false"/>
+          <w:i w:val="false"/>
+          <w:iCs w:val="false"/>
+          <w:sz w:val="22"/>
+          <w:szCs w:val="22"/>
+          <w:lang w:val="hr-HR"/>
+        </w:rPr>
+      </w:pPr>
+      <w:r>
+        <w:rPr>
+          <w:rFonts w:ascii="Courier New" w:hAnsi="Courier New"/>
+          <w:b w:val="false"/>
+          <w:bCs w:val="false"/>
+          <w:i w:val="false"/>
+          <w:iCs w:val="false"/>
+          <w:sz w:val="22"/>
+          <w:szCs w:val="22"/>
+          <w:lang w:val="hr-HR"/>
+        </w:rPr>
+        <w:t xml:space="preserve">            </w:t>
+      </w:r>
+      <w:r>
+        <w:rPr>
+          <w:rFonts w:ascii="Courier New" w:hAnsi="Courier New"/>
+          <w:b w:val="false"/>
+          <w:bCs w:val="false"/>
+          <w:i w:val="false"/>
+          <w:iCs w:val="false"/>
+          <w:sz w:val="22"/>
+          <w:szCs w:val="22"/>
+          <w:lang w:val="hr-HR"/>
+        </w:rPr>
+        <w:t>holder.getRegbankBView().setTypeface(null, NORMAL);</w:t>
+      </w:r>
+    </w:p>
+    <w:p>
+      <w:pPr>
+        <w:pStyle w:val="Normal"/>
+        <w:jc w:val="both"/>
+        <w:rPr>
+          <w:rFonts w:ascii="Courier New" w:hAnsi="Courier New"/>
+          <w:b w:val="false"/>
+          <w:bCs w:val="false"/>
+          <w:i w:val="false"/>
+          <w:iCs w:val="false"/>
+          <w:sz w:val="22"/>
+          <w:szCs w:val="22"/>
+          <w:lang w:val="hr-HR"/>
+        </w:rPr>
+      </w:pPr>
+      <w:r>
+        <w:rPr>
+          <w:rFonts w:ascii="Courier New" w:hAnsi="Courier New"/>
+          <w:b w:val="false"/>
+          <w:bCs w:val="false"/>
+          <w:i w:val="false"/>
+          <w:iCs w:val="false"/>
+          <w:sz w:val="22"/>
+          <w:szCs w:val="22"/>
+          <w:lang w:val="hr-HR"/>
+        </w:rPr>
+        <w:t xml:space="preserve">        </w:t>
+      </w:r>
+      <w:r>
+        <w:rPr>
+          <w:rFonts w:ascii="Courier New" w:hAnsi="Courier New"/>
+          <w:b w:val="false"/>
+          <w:bCs w:val="false"/>
+          <w:i w:val="false"/>
+          <w:iCs w:val="false"/>
+          <w:sz w:val="22"/>
+          <w:szCs w:val="22"/>
+          <w:lang w:val="hr-HR"/>
+        </w:rPr>
+        <w:t>return;</w:t>
+      </w:r>
+    </w:p>
+    <w:p>
+      <w:pPr>
+        <w:pStyle w:val="Normal"/>
+        <w:jc w:val="both"/>
+        <w:rPr>
+          <w:rFonts w:ascii="Courier New" w:hAnsi="Courier New"/>
+          <w:b w:val="false"/>
+          <w:bCs w:val="false"/>
+          <w:i w:val="false"/>
+          <w:iCs w:val="false"/>
+          <w:sz w:val="22"/>
+          <w:szCs w:val="22"/>
+          <w:lang w:val="hr-HR"/>
+        </w:rPr>
+      </w:pPr>
+      <w:r>
+        <w:rPr>
+          <w:rFonts w:ascii="Courier New" w:hAnsi="Courier New"/>
+          <w:b w:val="false"/>
+          <w:bCs w:val="false"/>
+          <w:i w:val="false"/>
+          <w:iCs w:val="false"/>
+          <w:sz w:val="22"/>
+          <w:szCs w:val="22"/>
+          <w:lang w:val="hr-HR"/>
+        </w:rPr>
+        <w:t xml:space="preserve">        </w:t>
+      </w:r>
+      <w:r>
+        <w:rPr>
+          <w:rFonts w:ascii="Courier New" w:hAnsi="Courier New"/>
+          <w:b w:val="false"/>
+          <w:bCs w:val="false"/>
+          <w:i w:val="false"/>
+          <w:iCs w:val="false"/>
+          <w:sz w:val="22"/>
+          <w:szCs w:val="22"/>
+          <w:lang w:val="hr-HR"/>
+        </w:rPr>
+        <w:t>}</w:t>
+      </w:r>
+    </w:p>
+    <w:p>
+      <w:pPr>
+        <w:pStyle w:val="Normal"/>
+        <w:jc w:val="both"/>
+        <w:rPr>
+          <w:rFonts w:ascii="Courier New" w:hAnsi="Courier New"/>
+          <w:b w:val="false"/>
+          <w:bCs w:val="false"/>
+          <w:i w:val="false"/>
+          <w:iCs w:val="false"/>
+          <w:sz w:val="22"/>
+          <w:szCs w:val="22"/>
+          <w:lang w:val="hr-HR"/>
+        </w:rPr>
+      </w:pPr>
+      <w:r>
+        <w:rPr>
+          <w:rFonts w:ascii="Courier New" w:hAnsi="Courier New"/>
+          <w:b w:val="false"/>
+          <w:bCs w:val="false"/>
+          <w:i w:val="false"/>
+          <w:iCs w:val="false"/>
+          <w:sz w:val="22"/>
+          <w:szCs w:val="22"/>
+          <w:lang w:val="hr-HR"/>
+        </w:rPr>
+        <w:t xml:space="preserve">        </w:t>
+      </w:r>
+      <w:r>
+        <w:rPr>
+          <w:rFonts w:ascii="Courier New" w:hAnsi="Courier New"/>
+          <w:b w:val="false"/>
+          <w:bCs w:val="false"/>
+          <w:i w:val="false"/>
+          <w:iCs w:val="false"/>
+          <w:sz w:val="22"/>
+          <w:szCs w:val="22"/>
+          <w:lang w:val="hr-HR"/>
+        </w:rPr>
+        <w:t>else {</w:t>
+      </w:r>
+    </w:p>
+    <w:p>
+      <w:pPr>
+        <w:pStyle w:val="Normal"/>
+        <w:jc w:val="both"/>
+        <w:rPr>
+          <w:rFonts w:ascii="Courier New" w:hAnsi="Courier New"/>
+          <w:b w:val="false"/>
+          <w:bCs w:val="false"/>
+          <w:i w:val="false"/>
+          <w:iCs w:val="false"/>
+          <w:sz w:val="22"/>
+          <w:szCs w:val="22"/>
+          <w:lang w:val="hr-HR"/>
+        </w:rPr>
+      </w:pPr>
+      <w:r>
+        <w:rPr>
+          <w:rFonts w:ascii="Courier New" w:hAnsi="Courier New"/>
+          <w:b w:val="false"/>
+          <w:bCs w:val="false"/>
+          <w:i w:val="false"/>
+          <w:iCs w:val="false"/>
+          <w:sz w:val="22"/>
+          <w:szCs w:val="22"/>
+          <w:lang w:val="hr-HR"/>
+        </w:rPr>
+        <w:t xml:space="preserve">            </w:t>
+      </w:r>
+      <w:r>
+        <w:rPr>
+          <w:rFonts w:ascii="Courier New" w:hAnsi="Courier New"/>
+          <w:b w:val="false"/>
+          <w:bCs w:val="false"/>
+          <w:i w:val="false"/>
+          <w:iCs w:val="false"/>
+          <w:sz w:val="22"/>
+          <w:szCs w:val="22"/>
+          <w:lang w:val="hr-HR"/>
+        </w:rPr>
+        <w:t>LinearLayout.LayoutParams params = (LinearLayout.LayoutParams) holder.getRegbankAView().getLayoutParams();</w:t>
+      </w:r>
+    </w:p>
+    <w:p>
+      <w:pPr>
+        <w:pStyle w:val="Normal"/>
+        <w:jc w:val="both"/>
+        <w:rPr>
+          <w:rFonts w:ascii="Courier New" w:hAnsi="Courier New"/>
+          <w:b w:val="false"/>
+          <w:bCs w:val="false"/>
+          <w:i w:val="false"/>
+          <w:iCs w:val="false"/>
+          <w:sz w:val="22"/>
+          <w:szCs w:val="22"/>
+          <w:lang w:val="hr-HR"/>
+        </w:rPr>
+      </w:pPr>
+      <w:r>
+        <w:rPr>
+          <w:rFonts w:ascii="Courier New" w:hAnsi="Courier New"/>
+          <w:b w:val="false"/>
+          <w:bCs w:val="false"/>
+          <w:i w:val="false"/>
+          <w:iCs w:val="false"/>
+          <w:sz w:val="22"/>
+          <w:szCs w:val="22"/>
+          <w:lang w:val="hr-HR"/>
+        </w:rPr>
+        <w:t xml:space="preserve">            </w:t>
+      </w:r>
+      <w:r>
+        <w:rPr>
+          <w:rFonts w:ascii="Courier New" w:hAnsi="Courier New"/>
+          <w:b w:val="false"/>
+          <w:bCs w:val="false"/>
+          <w:i w:val="false"/>
+          <w:iCs w:val="false"/>
+          <w:sz w:val="22"/>
+          <w:szCs w:val="22"/>
+          <w:lang w:val="hr-HR"/>
+        </w:rPr>
+        <w:t>params.weight = 1;</w:t>
+      </w:r>
+    </w:p>
+    <w:p>
+      <w:pPr>
+        <w:pStyle w:val="Normal"/>
+        <w:jc w:val="both"/>
+        <w:rPr>
+          <w:rFonts w:ascii="Courier New" w:hAnsi="Courier New"/>
+          <w:b w:val="false"/>
+          <w:bCs w:val="false"/>
+          <w:i w:val="false"/>
+          <w:iCs w:val="false"/>
+          <w:sz w:val="22"/>
+          <w:szCs w:val="22"/>
+          <w:lang w:val="hr-HR"/>
+        </w:rPr>
+      </w:pPr>
+      <w:r>
+        <w:rPr>
+          <w:rFonts w:ascii="Courier New" w:hAnsi="Courier New"/>
+          <w:b w:val="false"/>
+          <w:bCs w:val="false"/>
+          <w:i w:val="false"/>
+          <w:iCs w:val="false"/>
+          <w:sz w:val="22"/>
+          <w:szCs w:val="22"/>
+          <w:lang w:val="hr-HR"/>
+        </w:rPr>
+        <w:t xml:space="preserve">            </w:t>
+      </w:r>
+      <w:r>
+        <w:rPr>
+          <w:rFonts w:ascii="Courier New" w:hAnsi="Courier New"/>
+          <w:b w:val="false"/>
+          <w:bCs w:val="false"/>
+          <w:i w:val="false"/>
+          <w:iCs w:val="false"/>
+          <w:sz w:val="22"/>
+          <w:szCs w:val="22"/>
+          <w:lang w:val="hr-HR"/>
+        </w:rPr>
+        <w:t>holder.getRegbankAView().setLayoutParams(params);</w:t>
+      </w:r>
+    </w:p>
+    <w:p>
+      <w:pPr>
+        <w:pStyle w:val="Normal"/>
+        <w:jc w:val="both"/>
+        <w:rPr>
+          <w:rFonts w:ascii="Courier New" w:hAnsi="Courier New"/>
+          <w:b w:val="false"/>
+          <w:bCs w:val="false"/>
+          <w:i w:val="false"/>
+          <w:iCs w:val="false"/>
+          <w:sz w:val="22"/>
+          <w:szCs w:val="22"/>
+          <w:lang w:val="hr-HR"/>
+        </w:rPr>
+      </w:pPr>
+      <w:r>
+        <w:rPr>
+          <w:rFonts w:ascii="Courier New" w:hAnsi="Courier New"/>
+          <w:b w:val="false"/>
+          <w:bCs w:val="false"/>
+          <w:i w:val="false"/>
+          <w:iCs w:val="false"/>
+          <w:sz w:val="22"/>
+          <w:szCs w:val="22"/>
+          <w:lang w:val="hr-HR"/>
+        </w:rPr>
+        <w:t xml:space="preserve">            </w:t>
+      </w:r>
+      <w:r>
+        <w:rPr>
+          <w:rFonts w:ascii="Courier New" w:hAnsi="Courier New"/>
+          <w:b w:val="false"/>
+          <w:bCs w:val="false"/>
+          <w:i w:val="false"/>
+          <w:iCs w:val="false"/>
+          <w:sz w:val="22"/>
+          <w:szCs w:val="22"/>
+          <w:lang w:val="hr-HR"/>
+        </w:rPr>
+        <w:t>holder.getRegbankBView().setVisibility(View.VISIBLE);</w:t>
+      </w:r>
+    </w:p>
+    <w:p>
+      <w:pPr>
+        <w:pStyle w:val="Normal"/>
+        <w:jc w:val="both"/>
+        <w:rPr>
+          <w:rFonts w:ascii="Courier New" w:hAnsi="Courier New"/>
+          <w:b w:val="false"/>
+          <w:bCs w:val="false"/>
+          <w:i w:val="false"/>
+          <w:iCs w:val="false"/>
+          <w:sz w:val="22"/>
+          <w:szCs w:val="22"/>
+          <w:lang w:val="hr-HR"/>
+        </w:rPr>
+      </w:pPr>
+      <w:r>
+        <w:rPr>
+          <w:rFonts w:ascii="Courier New" w:hAnsi="Courier New"/>
+          <w:b w:val="false"/>
+          <w:bCs w:val="false"/>
+          <w:i w:val="false"/>
+          <w:iCs w:val="false"/>
+          <w:sz w:val="22"/>
+          <w:szCs w:val="22"/>
+          <w:lang w:val="hr-HR"/>
+        </w:rPr>
+        <w:t xml:space="preserve">        </w:t>
+      </w:r>
+      <w:r>
+        <w:rPr>
+          <w:rFonts w:ascii="Courier New" w:hAnsi="Courier New"/>
+          <w:b w:val="false"/>
+          <w:bCs w:val="false"/>
+          <w:i w:val="false"/>
+          <w:iCs w:val="false"/>
+          <w:sz w:val="22"/>
+          <w:szCs w:val="22"/>
+          <w:lang w:val="hr-HR"/>
+        </w:rPr>
+        <w:t>}</w:t>
+      </w:r>
+    </w:p>
+    <w:p>
+      <w:pPr>
+        <w:pStyle w:val="Normal"/>
+        <w:jc w:val="both"/>
+        <w:rPr>
+          <w:rFonts w:ascii="Times New Roman" w:hAnsi="Times New Roman"/>
+          <w:b w:val="false"/>
+          <w:bCs w:val="false"/>
+          <w:i w:val="false"/>
+          <w:iCs w:val="false"/>
+          <w:sz w:val="22"/>
+          <w:szCs w:val="22"/>
+          <w:lang w:val="hr-HR"/>
+        </w:rPr>
+      </w:pPr>
+      <w:r>
+        <w:rPr>
+          <w:rFonts w:ascii="Times New Roman" w:hAnsi="Times New Roman"/>
+          <w:b w:val="false"/>
+          <w:bCs w:val="false"/>
+          <w:i w:val="false"/>
+          <w:iCs w:val="false"/>
+          <w:sz w:val="22"/>
+          <w:szCs w:val="22"/>
+          <w:lang w:val="hr-HR"/>
+        </w:rPr>
         <w:t>Android aplikacija može se downloadati sa SourceForgea</w:t>
       </w:r>
       <w:r>
@@ -49779,7 +50700,7 @@
           <wp:inline distT="0" distB="0" distL="0" distR="0">
             <wp:extent cx="1698625" cy="437515"/>
             <wp:effectExtent l="0" t="0" r="0" b="0"/>
-            <wp:docPr id="50" name="Image4"/>
+            <wp:docPr id="51" name="Image4"/>
             <wp:cNvGraphicFramePr>
               <a:graphicFrameLocks xmlns:a="http://schemas.openxmlformats.org/drawingml/2006/main" noChangeAspect="1"/>
             </wp:cNvGraphicFramePr>
@@ -49787,13 +50708,13 @@
               <a:graphicData uri="http://schemas.openxmlformats.org/drawingml/2006/picture">
                 <pic:pic xmlns:pic="http://schemas.openxmlformats.org/drawingml/2006/picture">
                   <pic:nvPicPr>
-                    <pic:cNvPr id="50" name="Image4"/>
+                    <pic:cNvPr id="51" name="Image4"/>
                     <pic:cNvPicPr>
                       <a:picLocks noChangeAspect="1" noChangeArrowheads="1"/>
                     </pic:cNvPicPr>
                   </pic:nvPicPr>
                   <pic:blipFill>
-                    <a:blip r:embed="rId43"/>
+                    <a:blip r:embed="rId44"/>
                     <a:stretch>
                       <a:fillRect/>
                     </a:stretch>
@@ -52229,37 +53150,37 @@
         <a:srgbClr val="000000"/>
       </a:dk1>
       <a:lt1>
-        <a:srgbClr val="ffffff"/>
+        <a:srgbClr val="FFFFFF"/>
       </a:lt1>
       <a:dk2>
         <a:srgbClr val="000000"/>
       </a:dk2>
       <a:lt2>
-        <a:srgbClr val="ffffff"/>
+        <a:srgbClr val="FFFFFF"/>
       </a:lt2>
       <a:accent1>
-        <a:srgbClr val="18a303"/>
+        <a:srgbClr val="18A303"/>
       </a:accent1>
       <a:accent2>
-        <a:srgbClr val="0369a3"/>
+        <a:srgbClr val="0369A3"/>
       </a:accent2>
       <a:accent3>
-        <a:srgbClr val="a33e03"/>
+        <a:srgbClr val="A33E03"/>
       </a:accent3>
       <a:accent4>
-        <a:srgbClr val="8e03a3"/>
+        <a:srgbClr val="8E03A3"/>
       </a:accent4>
       <a:accent5>
-        <a:srgbClr val="c99c00"/>
+        <a:srgbClr val="C99C00"/>
       </a:accent5>
       <a:accent6>
-        <a:srgbClr val="c9211e"/>
+        <a:srgbClr val="C9211E"/>
       </a:accent6>
       <a:hlink>
-        <a:srgbClr val="0000ee"/>
+        <a:srgbClr val="0000EE"/>
       </a:hlink>
       <a:folHlink>
-        <a:srgbClr val="551a8b"/>
+        <a:srgbClr val="551A8B"/>
       </a:folHlink>
     </a:clrScheme>
     <a:fontScheme name="Office">

</xml_diff>